<commit_message>
final version 6 more updates final
</commit_message>
<xml_diff>
--- a/backstory.docx
+++ b/backstory.docx
@@ -4,25 +4,985 @@
   <w:body>
     <w:p>
       <w:pPr>
-        <w:rPr>
-          <w:lang w:val="en-SE"/>
-        </w:rPr>
-      </w:pPr>
-      <w:r>
-        <w:rPr>
-          <w:lang w:val="en-SE"/>
-        </w:rPr>
-        <w:t xml:space="preserve">The precious jewels of the Queen have been stolen. The burglars have been caught, but the stolen items have not been recovered. Based on the initial interrogation by the police and the evidence, it is evident that the jewels are kept in our premises. The Police department have come for help to the QCPD to find the hidden jewels. They have provided us with the evidence that they have collected. Some evidence is solved, but they need assistance to solve the rest. The task for us at QCPD is to investigate the evidence, follow the clues and uncover the stolen jewels that are hidden. </w:t>
+        <w:jc w:val="center"/>
+        <w:rPr>
+          <w:rFonts w:ascii="Bahnschrift SemiBold Condensed" w:hAnsi="Bahnschrift SemiBold Condensed"/>
+          <w:b/>
+          <w:bCs/>
+          <w:color w:val="BF4E14" w:themeColor="accent2" w:themeShade="BF"/>
+          <w:sz w:val="44"/>
+          <w:szCs w:val="44"/>
+        </w:rPr>
+      </w:pPr>
+      <w:r>
+        <w:rPr>
+          <w:rFonts w:ascii="Bahnschrift SemiBold Condensed" w:hAnsi="Bahnschrift SemiBold Condensed"/>
+          <w:b/>
+          <w:bCs/>
+          <w:color w:val="F1A983" w:themeColor="accent2" w:themeTint="99"/>
+          <w:sz w:val="44"/>
+          <w:szCs w:val="44"/>
+        </w:rPr>
+        <w:t xml:space="preserve">CASE DOSSIER </w:t>
+      </w:r>
+      <w:r>
+        <w:rPr>
+          <w:rFonts w:ascii="Bahnschrift SemiBold Condensed" w:hAnsi="Bahnschrift SemiBold Condensed"/>
+          <w:b/>
+          <w:bCs/>
+          <w:color w:val="F1A983" w:themeColor="accent2" w:themeTint="99"/>
+          <w:sz w:val="44"/>
+          <w:szCs w:val="44"/>
+        </w:rPr>
+        <w:t>-</w:t>
+      </w:r>
+      <w:r>
+        <w:rPr>
+          <w:rFonts w:ascii="Bahnschrift SemiBold Condensed" w:hAnsi="Bahnschrift SemiBold Condensed"/>
+          <w:b/>
+          <w:bCs/>
+          <w:color w:val="F1A983" w:themeColor="accent2" w:themeTint="99"/>
+          <w:sz w:val="44"/>
+          <w:szCs w:val="44"/>
+        </w:rPr>
+        <w:t xml:space="preserve"> </w:t>
+      </w:r>
+      <w:r>
+        <w:rPr>
+          <w:rFonts w:ascii="Bahnschrift SemiBold Condensed" w:hAnsi="Bahnschrift SemiBold Condensed"/>
+          <w:b/>
+          <w:bCs/>
+          <w:color w:val="47D459" w:themeColor="accent3" w:themeTint="99"/>
+          <w:sz w:val="44"/>
+          <w:szCs w:val="44"/>
+        </w:rPr>
+        <w:t>THE SAPPHIRE HEIST</w:t>
+      </w:r>
+    </w:p>
+    <w:p>
+      <w:pPr>
+        <w:rPr>
+          <w:sz w:val="30"/>
+          <w:szCs w:val="30"/>
+        </w:rPr>
+      </w:pPr>
+    </w:p>
+    <w:p>
+      <w:pPr>
+        <w:rPr>
+          <w:rFonts w:ascii="Agency FB" w:hAnsi="Agency FB"/>
+          <w:sz w:val="36"/>
+          <w:szCs w:val="36"/>
+        </w:rPr>
+      </w:pPr>
+      <w:r>
+        <w:rPr>
+          <w:rFonts w:ascii="Agency FB" w:hAnsi="Agency FB"/>
+          <w:sz w:val="36"/>
+          <w:szCs w:val="36"/>
+        </w:rPr>
+        <w:t>A high</w:t>
+      </w:r>
+      <w:r>
+        <w:rPr>
+          <w:rFonts w:ascii="Agency FB" w:hAnsi="Agency FB"/>
+          <w:sz w:val="36"/>
+          <w:szCs w:val="36"/>
+        </w:rPr>
+        <w:noBreakHyphen/>
+        <w:t xml:space="preserve">profile burglary has shaken the nation </w:t>
+      </w:r>
+      <w:r>
+        <w:rPr>
+          <w:rFonts w:ascii="Agency FB" w:hAnsi="Agency FB"/>
+          <w:sz w:val="36"/>
+          <w:szCs w:val="36"/>
+        </w:rPr>
+        <w:t>-</w:t>
+      </w:r>
+      <w:r>
+        <w:rPr>
+          <w:rFonts w:ascii="Agency FB" w:hAnsi="Agency FB"/>
+          <w:sz w:val="36"/>
+          <w:szCs w:val="36"/>
+        </w:rPr>
+        <w:t xml:space="preserve"> the Queen’s jewels have vanished. The burglars responsible were swiftly caught, but the stolen artifacts were not found with them.</w:t>
+      </w:r>
+    </w:p>
+    <w:p>
+      <w:pPr>
+        <w:rPr>
+          <w:rFonts w:ascii="Agency FB" w:hAnsi="Agency FB"/>
+          <w:sz w:val="36"/>
+          <w:szCs w:val="36"/>
+        </w:rPr>
+      </w:pPr>
+      <w:r>
+        <w:rPr>
+          <w:rFonts w:ascii="Agency FB" w:hAnsi="Agency FB"/>
+          <w:sz w:val="36"/>
+          <w:szCs w:val="36"/>
+        </w:rPr>
+        <w:t>Their interrogation revealed a chilling detail:</w:t>
+      </w:r>
+      <w:r>
+        <w:rPr>
+          <w:rFonts w:ascii="Agency FB" w:hAnsi="Agency FB"/>
+          <w:sz w:val="36"/>
+          <w:szCs w:val="36"/>
+        </w:rPr>
+        <w:br/>
+        <w:t>The jewels were secretly stashed inside our own building.</w:t>
+      </w:r>
+    </w:p>
+    <w:p>
+      <w:pPr>
+        <w:rPr>
+          <w:rFonts w:ascii="Agency FB" w:hAnsi="Agency FB"/>
+          <w:sz w:val="36"/>
+          <w:szCs w:val="36"/>
+        </w:rPr>
+      </w:pPr>
+      <w:r>
+        <w:rPr>
+          <w:rFonts w:ascii="Agency FB" w:hAnsi="Agency FB"/>
+          <w:sz w:val="36"/>
+          <w:szCs w:val="36"/>
+        </w:rPr>
+        <w:t>Because of this internal breach, the Police Department</w:t>
+      </w:r>
+      <w:r>
+        <w:rPr>
+          <w:rFonts w:ascii="Agency FB" w:hAnsi="Agency FB"/>
+          <w:sz w:val="36"/>
+          <w:szCs w:val="36"/>
+        </w:rPr>
+        <w:t xml:space="preserve"> has</w:t>
+      </w:r>
+      <w:r>
+        <w:rPr>
+          <w:rFonts w:ascii="Agency FB" w:hAnsi="Agency FB"/>
+          <w:sz w:val="36"/>
+          <w:szCs w:val="36"/>
+        </w:rPr>
+        <w:t xml:space="preserve"> requested assistance from </w:t>
+      </w:r>
+      <w:r>
+        <w:rPr>
+          <w:rFonts w:ascii="Agency FB" w:hAnsi="Agency FB"/>
+          <w:b/>
+          <w:bCs/>
+          <w:sz w:val="36"/>
+          <w:szCs w:val="36"/>
+        </w:rPr>
+        <w:t>QCPD</w:t>
+      </w:r>
+      <w:r>
+        <w:rPr>
+          <w:rFonts w:ascii="Agency FB" w:hAnsi="Agency FB"/>
+          <w:sz w:val="36"/>
+          <w:szCs w:val="36"/>
+        </w:rPr>
+        <w:t>, trusting our investigative precision and familiarity with the premises.</w:t>
+      </w:r>
+    </w:p>
+    <w:p>
+      <w:pPr>
+        <w:rPr>
+          <w:rFonts w:ascii="Agency FB" w:hAnsi="Agency FB"/>
+          <w:sz w:val="36"/>
+          <w:szCs w:val="36"/>
+        </w:rPr>
+      </w:pPr>
+      <w:r>
+        <w:rPr>
+          <w:rFonts w:ascii="Agency FB" w:hAnsi="Agency FB"/>
+          <w:sz w:val="36"/>
+          <w:szCs w:val="36"/>
+        </w:rPr>
+        <w:t xml:space="preserve">They </w:t>
+      </w:r>
+      <w:proofErr w:type="gramStart"/>
+      <w:r>
+        <w:rPr>
+          <w:rFonts w:ascii="Agency FB" w:hAnsi="Agency FB"/>
+          <w:sz w:val="36"/>
+          <w:szCs w:val="36"/>
+        </w:rPr>
+        <w:t>have handed</w:t>
+      </w:r>
+      <w:proofErr w:type="gramEnd"/>
+      <w:r>
+        <w:rPr>
+          <w:rFonts w:ascii="Agency FB" w:hAnsi="Agency FB"/>
+          <w:sz w:val="36"/>
+          <w:szCs w:val="36"/>
+        </w:rPr>
+        <w:t xml:space="preserve"> us:</w:t>
+      </w:r>
+    </w:p>
+    <w:p>
+      <w:pPr>
+        <w:numPr>
+          <w:ilvl w:val="0"/>
+          <w:numId w:val="2"/>
+        </w:numPr>
+        <w:jc w:val="both"/>
+        <w:rPr>
+          <w:rFonts w:ascii="Agency FB" w:hAnsi="Agency FB"/>
+          <w:sz w:val="36"/>
+          <w:szCs w:val="36"/>
+        </w:rPr>
+      </w:pPr>
+      <w:r>
+        <w:rPr>
+          <w:rFonts w:ascii="Agency FB" w:hAnsi="Agency FB"/>
+          <w:sz w:val="36"/>
+          <w:szCs w:val="36"/>
+        </w:rPr>
+        <w:t>Interrogation transcripts</w:t>
+      </w:r>
+    </w:p>
+    <w:p>
+      <w:pPr>
+        <w:numPr>
+          <w:ilvl w:val="0"/>
+          <w:numId w:val="2"/>
+        </w:numPr>
+        <w:jc w:val="both"/>
+        <w:rPr>
+          <w:rFonts w:ascii="Agency FB" w:hAnsi="Agency FB"/>
+          <w:sz w:val="36"/>
+          <w:szCs w:val="36"/>
+        </w:rPr>
+      </w:pPr>
+      <w:r>
+        <w:rPr>
+          <w:rFonts w:ascii="Agency FB" w:hAnsi="Agency FB"/>
+          <w:sz w:val="36"/>
+          <w:szCs w:val="36"/>
+        </w:rPr>
+        <w:t>Phone traces</w:t>
+      </w:r>
+    </w:p>
+    <w:p>
+      <w:pPr>
+        <w:numPr>
+          <w:ilvl w:val="0"/>
+          <w:numId w:val="2"/>
+        </w:numPr>
+        <w:jc w:val="both"/>
+        <w:rPr>
+          <w:rFonts w:ascii="Agency FB" w:hAnsi="Agency FB"/>
+          <w:sz w:val="36"/>
+          <w:szCs w:val="36"/>
+        </w:rPr>
+      </w:pPr>
+      <w:r>
+        <w:rPr>
+          <w:rFonts w:ascii="Agency FB" w:hAnsi="Agency FB"/>
+          <w:sz w:val="36"/>
+          <w:szCs w:val="36"/>
+        </w:rPr>
+        <w:t>Coded notes</w:t>
+      </w:r>
+    </w:p>
+    <w:p>
+      <w:pPr>
+        <w:numPr>
+          <w:ilvl w:val="0"/>
+          <w:numId w:val="2"/>
+        </w:numPr>
+        <w:jc w:val="both"/>
+        <w:rPr>
+          <w:rFonts w:ascii="Agency FB" w:hAnsi="Agency FB"/>
+          <w:sz w:val="36"/>
+          <w:szCs w:val="36"/>
+        </w:rPr>
+      </w:pPr>
+      <w:r>
+        <w:rPr>
+          <w:rFonts w:ascii="Agency FB" w:hAnsi="Agency FB"/>
+          <w:sz w:val="36"/>
+          <w:szCs w:val="36"/>
+        </w:rPr>
+        <w:t>Scrambled images</w:t>
+      </w:r>
+    </w:p>
+    <w:p>
+      <w:pPr>
+        <w:numPr>
+          <w:ilvl w:val="0"/>
+          <w:numId w:val="2"/>
+        </w:numPr>
+        <w:jc w:val="both"/>
+        <w:rPr>
+          <w:rFonts w:ascii="Agency FB" w:hAnsi="Agency FB"/>
+          <w:sz w:val="36"/>
+          <w:szCs w:val="36"/>
+        </w:rPr>
+      </w:pPr>
+      <w:r>
+        <w:rPr>
+          <w:rFonts w:ascii="Agency FB" w:hAnsi="Agency FB"/>
+          <w:sz w:val="36"/>
+          <w:szCs w:val="36"/>
+        </w:rPr>
+        <w:t>And device</w:t>
+      </w:r>
+      <w:r>
+        <w:rPr>
+          <w:rFonts w:ascii="Agency FB" w:hAnsi="Agency FB"/>
+          <w:sz w:val="36"/>
+          <w:szCs w:val="36"/>
+        </w:rPr>
+        <w:noBreakHyphen/>
+        <w:t>locked evidence hidden in puzzles</w:t>
+      </w:r>
+    </w:p>
+    <w:p>
+      <w:pPr>
+        <w:rPr>
+          <w:rFonts w:ascii="Agency FB" w:hAnsi="Agency FB"/>
+          <w:sz w:val="36"/>
+          <w:szCs w:val="36"/>
+        </w:rPr>
+      </w:pPr>
+      <w:r>
+        <w:rPr>
+          <w:rFonts w:ascii="Agency FB" w:hAnsi="Agency FB"/>
+          <w:sz w:val="36"/>
+          <w:szCs w:val="36"/>
+        </w:rPr>
+        <w:t>Some clues are solved.</w:t>
+      </w:r>
+      <w:r>
+        <w:rPr>
+          <w:rFonts w:ascii="Agency FB" w:hAnsi="Agency FB"/>
+          <w:sz w:val="36"/>
+          <w:szCs w:val="36"/>
+        </w:rPr>
+        <w:t xml:space="preserve"> </w:t>
+      </w:r>
+      <w:r>
+        <w:rPr>
+          <w:rFonts w:ascii="Agency FB" w:hAnsi="Agency FB"/>
+          <w:sz w:val="36"/>
+          <w:szCs w:val="36"/>
+        </w:rPr>
+        <w:t xml:space="preserve">Others require expert </w:t>
+      </w:r>
+      <w:r>
+        <w:rPr>
+          <w:rFonts w:ascii="Agency FB" w:hAnsi="Agency FB"/>
+          <w:sz w:val="36"/>
+          <w:szCs w:val="36"/>
+        </w:rPr>
+        <w:t>skills</w:t>
+      </w:r>
+      <w:r>
+        <w:rPr>
+          <w:rFonts w:ascii="Agency FB" w:hAnsi="Agency FB"/>
+          <w:sz w:val="36"/>
+          <w:szCs w:val="36"/>
+        </w:rPr>
+        <w:t>.</w:t>
+      </w:r>
+    </w:p>
+    <w:p>
+      <w:pPr>
+        <w:rPr>
+          <w:rFonts w:ascii="Agency FB" w:hAnsi="Agency FB"/>
+          <w:sz w:val="36"/>
+          <w:szCs w:val="36"/>
+        </w:rPr>
+      </w:pPr>
+      <w:r>
+        <w:rPr>
+          <w:rFonts w:ascii="Agency FB" w:hAnsi="Agency FB"/>
+          <w:sz w:val="36"/>
+          <w:szCs w:val="36"/>
+        </w:rPr>
+        <w:t xml:space="preserve">Our </w:t>
+      </w:r>
+      <w:r>
+        <w:rPr>
+          <w:rFonts w:ascii="Agency FB" w:hAnsi="Agency FB"/>
+          <w:sz w:val="36"/>
+          <w:szCs w:val="36"/>
+        </w:rPr>
+        <w:t>objective</w:t>
+      </w:r>
+      <w:r>
+        <w:rPr>
+          <w:rFonts w:ascii="Agency FB" w:hAnsi="Agency FB"/>
+          <w:sz w:val="36"/>
+          <w:szCs w:val="36"/>
+        </w:rPr>
+        <w:t xml:space="preserve"> is to t</w:t>
+      </w:r>
+      <w:r>
+        <w:rPr>
+          <w:rFonts w:ascii="Agency FB" w:hAnsi="Agency FB"/>
+          <w:sz w:val="36"/>
+          <w:szCs w:val="36"/>
+        </w:rPr>
+        <w:t>race the evidence,</w:t>
+      </w:r>
+      <w:r>
+        <w:rPr>
+          <w:rFonts w:ascii="Agency FB" w:hAnsi="Agency FB"/>
+          <w:sz w:val="36"/>
+          <w:szCs w:val="36"/>
+        </w:rPr>
+        <w:t xml:space="preserve"> d</w:t>
+      </w:r>
+      <w:r>
+        <w:rPr>
+          <w:rFonts w:ascii="Agency FB" w:hAnsi="Agency FB"/>
+          <w:sz w:val="36"/>
+          <w:szCs w:val="36"/>
+        </w:rPr>
+        <w:t xml:space="preserve">ecode every puzzle, and recover the stolen jewels </w:t>
+      </w:r>
+      <w:proofErr w:type="gramStart"/>
+      <w:r>
+        <w:rPr>
+          <w:rFonts w:ascii="Agency FB" w:hAnsi="Agency FB"/>
+          <w:sz w:val="36"/>
+          <w:szCs w:val="36"/>
+        </w:rPr>
+        <w:t>hidden on</w:t>
+      </w:r>
+      <w:r>
+        <w:rPr>
+          <w:rFonts w:ascii="Agency FB" w:hAnsi="Agency FB"/>
+          <w:sz w:val="36"/>
+          <w:szCs w:val="36"/>
+        </w:rPr>
+        <w:noBreakHyphen/>
+        <w:t>site</w:t>
+      </w:r>
+      <w:proofErr w:type="gramEnd"/>
+      <w:r>
+        <w:rPr>
+          <w:rFonts w:ascii="Agency FB" w:hAnsi="Agency FB"/>
+          <w:sz w:val="36"/>
+          <w:szCs w:val="36"/>
+        </w:rPr>
+        <w:t>.</w:t>
+      </w:r>
+    </w:p>
+    <w:p>
+      <w:pPr>
+        <w:rPr>
+          <w:rFonts w:ascii="Agency FB" w:hAnsi="Agency FB"/>
+          <w:sz w:val="36"/>
+          <w:szCs w:val="36"/>
+        </w:rPr>
+      </w:pPr>
+    </w:p>
+    <w:p>
+      <w:pPr>
+        <w:rPr>
+          <w:rFonts w:ascii="Agency FB" w:hAnsi="Agency FB"/>
+          <w:sz w:val="36"/>
+          <w:szCs w:val="36"/>
+        </w:rPr>
+      </w:pPr>
+      <w:r>
+        <w:rPr>
+          <w:rFonts w:ascii="Agency FB" w:hAnsi="Agency FB"/>
+          <w:sz w:val="36"/>
+          <w:szCs w:val="36"/>
+        </w:rPr>
+        <w:t>Move carefully, think critically, and follow every thread.</w:t>
+      </w:r>
+      <w:r>
+        <w:rPr>
+          <w:rFonts w:ascii="Agency FB" w:hAnsi="Agency FB"/>
+          <w:sz w:val="36"/>
+          <w:szCs w:val="36"/>
+        </w:rPr>
+        <w:br/>
+        <w:t>The success of this case depends entirely on your deductions.</w:t>
       </w:r>
     </w:p>
     <w:sectPr>
+      <w:headerReference w:type="default" r:id="rId7"/>
+      <w:footerReference w:type="default" r:id="rId8"/>
       <w:pgSz w:w="12240" w:h="15840"/>
-      <w:pgMar w:top="1440" w:right="1440" w:bottom="1440" w:left="1440" w:header="708" w:footer="708" w:gutter="0"/>
+      <w:pgMar w:top="1440" w:right="1440" w:bottom="1440" w:left="1440" w:header="340" w:footer="510" w:gutter="0"/>
       <w:cols w:space="708"/>
       <w:docGrid w:linePitch="360"/>
     </w:sectPr>
   </w:body>
 </w:document>
+</file>
+
+<file path=word/endnotes.xml><?xml version="1.0" encoding="utf-8"?>
+<w:endnotes xmlns:wpc="http://schemas.microsoft.com/office/word/2010/wordprocessingCanvas" xmlns:cx="http://schemas.microsoft.com/office/drawing/2014/chartex" xmlns:cx1="http://schemas.microsoft.com/office/drawing/2015/9/8/chartex" xmlns:cx2="http://schemas.microsoft.com/office/drawing/2015/10/21/chartex" xmlns:cx3="http://schemas.microsoft.com/office/drawing/2016/5/9/chartex" xmlns:cx4="http://schemas.microsoft.com/office/drawing/2016/5/10/chartex" xmlns:cx5="http://schemas.microsoft.com/office/drawing/2016/5/11/chartex" xmlns:cx6="http://schemas.microsoft.com/office/drawing/2016/5/12/chartex" xmlns:cx7="http://schemas.microsoft.com/office/drawing/2016/5/13/chartex" xmlns:cx8="http://schemas.microsoft.com/office/drawing/2016/5/14/chartex" xmlns:mc="http://schemas.openxmlformats.org/markup-compatibility/2006" xmlns:aink="http://schemas.microsoft.com/office/drawing/2016/ink" xmlns:am3d="http://schemas.microsoft.com/office/drawing/2017/model3d" xmlns:o="urn:schemas-microsoft-com:office:office" xmlns:oel="http://schemas.microsoft.com/office/2019/extlst" xmlns:r="http://schemas.openxmlformats.org/officeDocument/2006/relationships" xmlns:m="http://schemas.openxmlformats.org/officeDocument/2006/math" xmlns:v="urn:schemas-microsoft-com:vml" xmlns:wp14="http://schemas.microsoft.com/office/word/2010/wordprocessingDrawing" xmlns:wp="http://schemas.openxmlformats.org/drawingml/2006/wordprocessingDrawing" xmlns:w10="urn:schemas-microsoft-com:office:word" xmlns:w="http://schemas.openxmlformats.org/wordprocessingml/2006/main" xmlns:w14="http://schemas.microsoft.com/office/word/2010/wordml" xmlns:w15="http://schemas.microsoft.com/office/word/2012/wordml" xmlns:w16cex="http://schemas.microsoft.com/office/word/2018/wordml/cex" xmlns:w16cid="http://schemas.microsoft.com/office/word/2016/wordml/cid" xmlns:w16="http://schemas.microsoft.com/office/word/2018/wordml" xmlns:w16du="http://schemas.microsoft.com/office/word/2023/wordml/word16du" xmlns:w16sdtdh="http://schemas.microsoft.com/office/word/2020/wordml/sdtdatahash" xmlns:w16sdtfl="http://schemas.microsoft.com/office/word/2024/wordml/sdtformatlock" xmlns:w16se="http://schemas.microsoft.com/office/word/2015/wordml/symex" xmlns:wpg="http://schemas.microsoft.com/office/word/2010/wordprocessingGroup" xmlns:wpi="http://schemas.microsoft.com/office/word/2010/wordprocessingInk" xmlns:wne="http://schemas.microsoft.com/office/word/2006/wordml" xmlns:wps="http://schemas.microsoft.com/office/word/2010/wordprocessingShape" mc:Ignorable="w14 w15 w16se w16cid w16 w16cex w16sdtdh w16sdtfl w16du wp14">
+  <w:endnote w:type="separator" w:id="-1">
+    <w:p>
+      <w:pPr>
+        <w:spacing w:after="0" w:line="240" w:lineRule="auto"/>
+      </w:pPr>
+      <w:r>
+        <w:separator/>
+      </w:r>
+    </w:p>
+  </w:endnote>
+  <w:endnote w:type="continuationSeparator" w:id="0">
+    <w:p>
+      <w:pPr>
+        <w:spacing w:after="0" w:line="240" w:lineRule="auto"/>
+      </w:pPr>
+      <w:r>
+        <w:continuationSeparator/>
+      </w:r>
+    </w:p>
+  </w:endnote>
+</w:endnotes>
+</file>
+
+<file path=word/footer1.xml><?xml version="1.0" encoding="utf-8"?>
+<w:ftr xmlns:wpc="http://schemas.microsoft.com/office/word/2010/wordprocessingCanvas" xmlns:cx="http://schemas.microsoft.com/office/drawing/2014/chartex" xmlns:cx1="http://schemas.microsoft.com/office/drawing/2015/9/8/chartex" xmlns:cx2="http://schemas.microsoft.com/office/drawing/2015/10/21/chartex" xmlns:cx3="http://schemas.microsoft.com/office/drawing/2016/5/9/chartex" xmlns:cx4="http://schemas.microsoft.com/office/drawing/2016/5/10/chartex" xmlns:cx5="http://schemas.microsoft.com/office/drawing/2016/5/11/chartex" xmlns:cx6="http://schemas.microsoft.com/office/drawing/2016/5/12/chartex" xmlns:cx7="http://schemas.microsoft.com/office/drawing/2016/5/13/chartex" xmlns:cx8="http://schemas.microsoft.com/office/drawing/2016/5/14/chartex" xmlns:mc="http://schemas.openxmlformats.org/markup-compatibility/2006" xmlns:aink="http://schemas.microsoft.com/office/drawing/2016/ink" xmlns:am3d="http://schemas.microsoft.com/office/drawing/2017/model3d" xmlns:o="urn:schemas-microsoft-com:office:office" xmlns:oel="http://schemas.microsoft.com/office/2019/extlst" xmlns:r="http://schemas.openxmlformats.org/officeDocument/2006/relationships" xmlns:m="http://schemas.openxmlformats.org/officeDocument/2006/math" xmlns:v="urn:schemas-microsoft-com:vml" xmlns:wp14="http://schemas.microsoft.com/office/word/2010/wordprocessingDrawing" xmlns:wp="http://schemas.openxmlformats.org/drawingml/2006/wordprocessingDrawing" xmlns:w10="urn:schemas-microsoft-com:office:word" xmlns:w="http://schemas.openxmlformats.org/wordprocessingml/2006/main" xmlns:w14="http://schemas.microsoft.com/office/word/2010/wordml" xmlns:w15="http://schemas.microsoft.com/office/word/2012/wordml" xmlns:w16cex="http://schemas.microsoft.com/office/word/2018/wordml/cex" xmlns:w16cid="http://schemas.microsoft.com/office/word/2016/wordml/cid" xmlns:w16="http://schemas.microsoft.com/office/word/2018/wordml" xmlns:w16du="http://schemas.microsoft.com/office/word/2023/wordml/word16du" xmlns:w16sdtdh="http://schemas.microsoft.com/office/word/2020/wordml/sdtdatahash" xmlns:w16sdtfl="http://schemas.microsoft.com/office/word/2024/wordml/sdtformatlock" xmlns:w16se="http://schemas.microsoft.com/office/word/2015/wordml/symex" xmlns:wpg="http://schemas.microsoft.com/office/word/2010/wordprocessingGroup" xmlns:wpi="http://schemas.microsoft.com/office/word/2010/wordprocessingInk" xmlns:wne="http://schemas.microsoft.com/office/word/2006/wordml" xmlns:wps="http://schemas.microsoft.com/office/word/2010/wordprocessingShape" mc:Ignorable="w14 w15 w16se w16cid w16 w16cex w16sdtdh w16sdtfl w16du wp14">
+  <w:p>
+    <w:pPr>
+      <w:pStyle w:val="Footer"/>
+      <w:jc w:val="center"/>
+      <w:rPr>
+        <w:rFonts w:ascii="Berlin Sans FB Demi" w:hAnsi="Berlin Sans FB Demi"/>
+        <w:b/>
+        <w:bCs/>
+        <w:color w:val="FF0000"/>
+        <w:lang w:val="en-SE"/>
+      </w:rPr>
+    </w:pPr>
+    <w:r>
+      <w:rPr>
+        <w:rFonts w:ascii="Berlin Sans FB Demi" w:hAnsi="Berlin Sans FB Demi"/>
+        <w:b/>
+        <w:bCs/>
+        <w:color w:val="FF0000"/>
+        <w:lang w:val="en-SE"/>
+      </w:rPr>
+      <w:t xml:space="preserve">Confidential Material - </w:t>
+    </w:r>
+    <w:r>
+      <w:rPr>
+        <w:rFonts w:ascii="Berlin Sans FB Demi" w:hAnsi="Berlin Sans FB Demi"/>
+        <w:b/>
+        <w:bCs/>
+        <w:color w:val="FF0000"/>
+        <w:lang w:val="en-SE"/>
+      </w:rPr>
+      <w:t>QCPD</w:t>
+    </w:r>
+  </w:p>
+</w:ftr>
+</file>
+
+<file path=word/footnotes.xml><?xml version="1.0" encoding="utf-8"?>
+<w:footnotes xmlns:wpc="http://schemas.microsoft.com/office/word/2010/wordprocessingCanvas" xmlns:cx="http://schemas.microsoft.com/office/drawing/2014/chartex" xmlns:cx1="http://schemas.microsoft.com/office/drawing/2015/9/8/chartex" xmlns:cx2="http://schemas.microsoft.com/office/drawing/2015/10/21/chartex" xmlns:cx3="http://schemas.microsoft.com/office/drawing/2016/5/9/chartex" xmlns:cx4="http://schemas.microsoft.com/office/drawing/2016/5/10/chartex" xmlns:cx5="http://schemas.microsoft.com/office/drawing/2016/5/11/chartex" xmlns:cx6="http://schemas.microsoft.com/office/drawing/2016/5/12/chartex" xmlns:cx7="http://schemas.microsoft.com/office/drawing/2016/5/13/chartex" xmlns:cx8="http://schemas.microsoft.com/office/drawing/2016/5/14/chartex" xmlns:mc="http://schemas.openxmlformats.org/markup-compatibility/2006" xmlns:aink="http://schemas.microsoft.com/office/drawing/2016/ink" xmlns:am3d="http://schemas.microsoft.com/office/drawing/2017/model3d" xmlns:o="urn:schemas-microsoft-com:office:office" xmlns:oel="http://schemas.microsoft.com/office/2019/extlst" xmlns:r="http://schemas.openxmlformats.org/officeDocument/2006/relationships" xmlns:m="http://schemas.openxmlformats.org/officeDocument/2006/math" xmlns:v="urn:schemas-microsoft-com:vml" xmlns:wp14="http://schemas.microsoft.com/office/word/2010/wordprocessingDrawing" xmlns:wp="http://schemas.openxmlformats.org/drawingml/2006/wordprocessingDrawing" xmlns:w10="urn:schemas-microsoft-com:office:word" xmlns:w="http://schemas.openxmlformats.org/wordprocessingml/2006/main" xmlns:w14="http://schemas.microsoft.com/office/word/2010/wordml" xmlns:w15="http://schemas.microsoft.com/office/word/2012/wordml" xmlns:w16cex="http://schemas.microsoft.com/office/word/2018/wordml/cex" xmlns:w16cid="http://schemas.microsoft.com/office/word/2016/wordml/cid" xmlns:w16="http://schemas.microsoft.com/office/word/2018/wordml" xmlns:w16du="http://schemas.microsoft.com/office/word/2023/wordml/word16du" xmlns:w16sdtdh="http://schemas.microsoft.com/office/word/2020/wordml/sdtdatahash" xmlns:w16sdtfl="http://schemas.microsoft.com/office/word/2024/wordml/sdtformatlock" xmlns:w16se="http://schemas.microsoft.com/office/word/2015/wordml/symex" xmlns:wpg="http://schemas.microsoft.com/office/word/2010/wordprocessingGroup" xmlns:wpi="http://schemas.microsoft.com/office/word/2010/wordprocessingInk" xmlns:wne="http://schemas.microsoft.com/office/word/2006/wordml" xmlns:wps="http://schemas.microsoft.com/office/word/2010/wordprocessingShape" mc:Ignorable="w14 w15 w16se w16cid w16 w16cex w16sdtdh w16sdtfl w16du wp14">
+  <w:footnote w:type="separator" w:id="-1">
+    <w:p>
+      <w:pPr>
+        <w:spacing w:after="0" w:line="240" w:lineRule="auto"/>
+      </w:pPr>
+      <w:r>
+        <w:separator/>
+      </w:r>
+    </w:p>
+  </w:footnote>
+  <w:footnote w:type="continuationSeparator" w:id="0">
+    <w:p>
+      <w:pPr>
+        <w:spacing w:after="0" w:line="240" w:lineRule="auto"/>
+      </w:pPr>
+      <w:r>
+        <w:continuationSeparator/>
+      </w:r>
+    </w:p>
+  </w:footnote>
+</w:footnotes>
+</file>
+
+<file path=word/header1.xml><?xml version="1.0" encoding="utf-8"?>
+<w:hdr xmlns:wpc="http://schemas.microsoft.com/office/word/2010/wordprocessingCanvas" xmlns:cx="http://schemas.microsoft.com/office/drawing/2014/chartex" xmlns:cx1="http://schemas.microsoft.com/office/drawing/2015/9/8/chartex" xmlns:cx2="http://schemas.microsoft.com/office/drawing/2015/10/21/chartex" xmlns:cx3="http://schemas.microsoft.com/office/drawing/2016/5/9/chartex" xmlns:cx4="http://schemas.microsoft.com/office/drawing/2016/5/10/chartex" xmlns:cx5="http://schemas.microsoft.com/office/drawing/2016/5/11/chartex" xmlns:cx6="http://schemas.microsoft.com/office/drawing/2016/5/12/chartex" xmlns:cx7="http://schemas.microsoft.com/office/drawing/2016/5/13/chartex" xmlns:cx8="http://schemas.microsoft.com/office/drawing/2016/5/14/chartex" xmlns:mc="http://schemas.openxmlformats.org/markup-compatibility/2006" xmlns:aink="http://schemas.microsoft.com/office/drawing/2016/ink" xmlns:am3d="http://schemas.microsoft.com/office/drawing/2017/model3d" xmlns:o="urn:schemas-microsoft-com:office:office" xmlns:oel="http://schemas.microsoft.com/office/2019/extlst" xmlns:r="http://schemas.openxmlformats.org/officeDocument/2006/relationships" xmlns:m="http://schemas.openxmlformats.org/officeDocument/2006/math" xmlns:v="urn:schemas-microsoft-com:vml" xmlns:wp14="http://schemas.microsoft.com/office/word/2010/wordprocessingDrawing" xmlns:wp="http://schemas.openxmlformats.org/drawingml/2006/wordprocessingDrawing" xmlns:w10="urn:schemas-microsoft-com:office:word" xmlns:w="http://schemas.openxmlformats.org/wordprocessingml/2006/main" xmlns:w14="http://schemas.microsoft.com/office/word/2010/wordml" xmlns:w15="http://schemas.microsoft.com/office/word/2012/wordml" xmlns:w16cex="http://schemas.microsoft.com/office/word/2018/wordml/cex" xmlns:w16cid="http://schemas.microsoft.com/office/word/2016/wordml/cid" xmlns:w16="http://schemas.microsoft.com/office/word/2018/wordml" xmlns:w16du="http://schemas.microsoft.com/office/word/2023/wordml/word16du" xmlns:w16sdtdh="http://schemas.microsoft.com/office/word/2020/wordml/sdtdatahash" xmlns:w16sdtfl="http://schemas.microsoft.com/office/word/2024/wordml/sdtformatlock" xmlns:w16se="http://schemas.microsoft.com/office/word/2015/wordml/symex" xmlns:wpg="http://schemas.microsoft.com/office/word/2010/wordprocessingGroup" xmlns:wpi="http://schemas.microsoft.com/office/word/2010/wordprocessingInk" xmlns:wne="http://schemas.microsoft.com/office/word/2006/wordml" xmlns:wps="http://schemas.microsoft.com/office/word/2010/wordprocessingShape" mc:Ignorable="w14 w15 w16se w16cid w16 w16cex w16sdtdh w16sdtfl w16du wp14">
+  <w:p>
+    <w:pPr>
+      <w:pStyle w:val="Header"/>
+      <w:jc w:val="right"/>
+      <w:rPr>
+        <w:rFonts w:ascii="Agency FB" w:hAnsi="Agency FB"/>
+        <w:color w:val="FFFF00"/>
+        <w:sz w:val="16"/>
+        <w:szCs w:val="16"/>
+        <w:lang w:val="en-SE"/>
+      </w:rPr>
+    </w:pPr>
+    <w:r>
+      <w:rPr>
+        <w:rFonts w:ascii="Agency FB" w:hAnsi="Agency FB"/>
+        <w:color w:val="FFFF00"/>
+        <w:sz w:val="16"/>
+        <w:szCs w:val="16"/>
+        <w:lang w:val="en-SE"/>
+      </w:rPr>
+      <w:t xml:space="preserve">Case Number: </w:t>
+    </w:r>
+    <w:r>
+      <w:rPr>
+        <w:rFonts w:ascii="Agency FB" w:hAnsi="Agency FB"/>
+        <w:color w:val="FFFF00"/>
+        <w:sz w:val="16"/>
+        <w:szCs w:val="16"/>
+        <w:lang w:val="en-SE"/>
+      </w:rPr>
+      <w:t>9</w:t>
+    </w:r>
+    <w:r>
+      <w:rPr>
+        <w:rFonts w:ascii="Agency FB" w:hAnsi="Agency FB"/>
+        <w:color w:val="FFFF00"/>
+        <w:sz w:val="16"/>
+        <w:szCs w:val="16"/>
+        <w:lang w:val="en-SE"/>
+      </w:rPr>
+      <w:t>/</w:t>
+    </w:r>
+    <w:r>
+      <w:rPr>
+        <w:rFonts w:ascii="Agency FB" w:hAnsi="Agency FB"/>
+        <w:color w:val="FFFF00"/>
+        <w:sz w:val="16"/>
+        <w:szCs w:val="16"/>
+        <w:lang w:val="en-SE"/>
+      </w:rPr>
+      <w:t>73/</w:t>
+    </w:r>
+    <w:r>
+      <w:rPr>
+        <w:rFonts w:ascii="Agency FB" w:hAnsi="Agency FB"/>
+        <w:color w:val="FFFF00"/>
+        <w:sz w:val="16"/>
+        <w:szCs w:val="16"/>
+        <w:lang w:val="en-SE"/>
+      </w:rPr>
+      <w:t>6/26</w:t>
+    </w:r>
+  </w:p>
+</w:hdr>
+</file>
+
+<file path=word/numbering.xml><?xml version="1.0" encoding="utf-8"?>
+<w:numbering xmlns:wpc="http://schemas.microsoft.com/office/word/2010/wordprocessingCanvas" xmlns:cx="http://schemas.microsoft.com/office/drawing/2014/chartex" xmlns:cx1="http://schemas.microsoft.com/office/drawing/2015/9/8/chartex" xmlns:cx2="http://schemas.microsoft.com/office/drawing/2015/10/21/chartex" xmlns:cx3="http://schemas.microsoft.com/office/drawing/2016/5/9/chartex" xmlns:cx4="http://schemas.microsoft.com/office/drawing/2016/5/10/chartex" xmlns:cx5="http://schemas.microsoft.com/office/drawing/2016/5/11/chartex" xmlns:cx6="http://schemas.microsoft.com/office/drawing/2016/5/12/chartex" xmlns:cx7="http://schemas.microsoft.com/office/drawing/2016/5/13/chartex" xmlns:cx8="http://schemas.microsoft.com/office/drawing/2016/5/14/chartex" xmlns:mc="http://schemas.openxmlformats.org/markup-compatibility/2006" xmlns:aink="http://schemas.microsoft.com/office/drawing/2016/ink" xmlns:am3d="http://schemas.microsoft.com/office/drawing/2017/model3d" xmlns:o="urn:schemas-microsoft-com:office:office" xmlns:oel="http://schemas.microsoft.com/office/2019/extlst" xmlns:r="http://schemas.openxmlformats.org/officeDocument/2006/relationships" xmlns:m="http://schemas.openxmlformats.org/officeDocument/2006/math" xmlns:v="urn:schemas-microsoft-com:vml" xmlns:wp14="http://schemas.microsoft.com/office/word/2010/wordprocessingDrawing" xmlns:wp="http://schemas.openxmlformats.org/drawingml/2006/wordprocessingDrawing" xmlns:w10="urn:schemas-microsoft-com:office:word" xmlns:w="http://schemas.openxmlformats.org/wordprocessingml/2006/main" xmlns:w14="http://schemas.microsoft.com/office/word/2010/wordml" xmlns:w15="http://schemas.microsoft.com/office/word/2012/wordml" xmlns:w16cex="http://schemas.microsoft.com/office/word/2018/wordml/cex" xmlns:w16cid="http://schemas.microsoft.com/office/word/2016/wordml/cid" xmlns:w16="http://schemas.microsoft.com/office/word/2018/wordml" xmlns:w16du="http://schemas.microsoft.com/office/word/2023/wordml/word16du" xmlns:w16sdtdh="http://schemas.microsoft.com/office/word/2020/wordml/sdtdatahash" xmlns:w16sdtfl="http://schemas.microsoft.com/office/word/2024/wordml/sdtformatlock" xmlns:w16se="http://schemas.microsoft.com/office/word/2015/wordml/symex" xmlns:wpg="http://schemas.microsoft.com/office/word/2010/wordprocessingGroup" xmlns:wpi="http://schemas.microsoft.com/office/word/2010/wordprocessingInk" xmlns:wne="http://schemas.microsoft.com/office/word/2006/wordml" xmlns:wps="http://schemas.microsoft.com/office/word/2010/wordprocessingShape" mc:Ignorable="w14 w15 w16se w16cid w16 w16cex w16sdtdh w16sdtfl w16du wp14">
+  <w:abstractNum w:abstractNumId="0" w15:restartNumberingAfterBreak="0">
+    <w:nsid w:val="1D266C04"/>
+    <w:multiLevelType w:val="multilevel"/>
+    <w:tmpl w:val="616E344C"/>
+    <w:lvl w:ilvl="0">
+      <w:start w:val="1"/>
+      <w:numFmt w:val="bullet"/>
+      <w:lvlText w:val=""/>
+      <w:lvlJc w:val="left"/>
+      <w:pPr>
+        <w:tabs>
+          <w:tab w:val="num" w:pos="720"/>
+        </w:tabs>
+        <w:ind w:left="720" w:hanging="360"/>
+      </w:pPr>
+      <w:rPr>
+        <w:rFonts w:ascii="Symbol" w:hAnsi="Symbol" w:hint="default"/>
+        <w:sz w:val="20"/>
+      </w:rPr>
+    </w:lvl>
+    <w:lvl w:ilvl="1" w:tentative="1">
+      <w:start w:val="1"/>
+      <w:numFmt w:val="bullet"/>
+      <w:lvlText w:val="o"/>
+      <w:lvlJc w:val="left"/>
+      <w:pPr>
+        <w:tabs>
+          <w:tab w:val="num" w:pos="1440"/>
+        </w:tabs>
+        <w:ind w:left="1440" w:hanging="360"/>
+      </w:pPr>
+      <w:rPr>
+        <w:rFonts w:ascii="Courier New" w:hAnsi="Courier New" w:hint="default"/>
+        <w:sz w:val="20"/>
+      </w:rPr>
+    </w:lvl>
+    <w:lvl w:ilvl="2" w:tentative="1">
+      <w:start w:val="1"/>
+      <w:numFmt w:val="bullet"/>
+      <w:lvlText w:val=""/>
+      <w:lvlJc w:val="left"/>
+      <w:pPr>
+        <w:tabs>
+          <w:tab w:val="num" w:pos="2160"/>
+        </w:tabs>
+        <w:ind w:left="2160" w:hanging="360"/>
+      </w:pPr>
+      <w:rPr>
+        <w:rFonts w:ascii="Wingdings" w:hAnsi="Wingdings" w:hint="default"/>
+        <w:sz w:val="20"/>
+      </w:rPr>
+    </w:lvl>
+    <w:lvl w:ilvl="3" w:tentative="1">
+      <w:start w:val="1"/>
+      <w:numFmt w:val="bullet"/>
+      <w:lvlText w:val=""/>
+      <w:lvlJc w:val="left"/>
+      <w:pPr>
+        <w:tabs>
+          <w:tab w:val="num" w:pos="2880"/>
+        </w:tabs>
+        <w:ind w:left="2880" w:hanging="360"/>
+      </w:pPr>
+      <w:rPr>
+        <w:rFonts w:ascii="Wingdings" w:hAnsi="Wingdings" w:hint="default"/>
+        <w:sz w:val="20"/>
+      </w:rPr>
+    </w:lvl>
+    <w:lvl w:ilvl="4" w:tentative="1">
+      <w:start w:val="1"/>
+      <w:numFmt w:val="bullet"/>
+      <w:lvlText w:val=""/>
+      <w:lvlJc w:val="left"/>
+      <w:pPr>
+        <w:tabs>
+          <w:tab w:val="num" w:pos="3600"/>
+        </w:tabs>
+        <w:ind w:left="3600" w:hanging="360"/>
+      </w:pPr>
+      <w:rPr>
+        <w:rFonts w:ascii="Wingdings" w:hAnsi="Wingdings" w:hint="default"/>
+        <w:sz w:val="20"/>
+      </w:rPr>
+    </w:lvl>
+    <w:lvl w:ilvl="5" w:tentative="1">
+      <w:start w:val="1"/>
+      <w:numFmt w:val="bullet"/>
+      <w:lvlText w:val=""/>
+      <w:lvlJc w:val="left"/>
+      <w:pPr>
+        <w:tabs>
+          <w:tab w:val="num" w:pos="4320"/>
+        </w:tabs>
+        <w:ind w:left="4320" w:hanging="360"/>
+      </w:pPr>
+      <w:rPr>
+        <w:rFonts w:ascii="Wingdings" w:hAnsi="Wingdings" w:hint="default"/>
+        <w:sz w:val="20"/>
+      </w:rPr>
+    </w:lvl>
+    <w:lvl w:ilvl="6" w:tentative="1">
+      <w:start w:val="1"/>
+      <w:numFmt w:val="bullet"/>
+      <w:lvlText w:val=""/>
+      <w:lvlJc w:val="left"/>
+      <w:pPr>
+        <w:tabs>
+          <w:tab w:val="num" w:pos="5040"/>
+        </w:tabs>
+        <w:ind w:left="5040" w:hanging="360"/>
+      </w:pPr>
+      <w:rPr>
+        <w:rFonts w:ascii="Wingdings" w:hAnsi="Wingdings" w:hint="default"/>
+        <w:sz w:val="20"/>
+      </w:rPr>
+    </w:lvl>
+    <w:lvl w:ilvl="7" w:tentative="1">
+      <w:start w:val="1"/>
+      <w:numFmt w:val="bullet"/>
+      <w:lvlText w:val=""/>
+      <w:lvlJc w:val="left"/>
+      <w:pPr>
+        <w:tabs>
+          <w:tab w:val="num" w:pos="5760"/>
+        </w:tabs>
+        <w:ind w:left="5760" w:hanging="360"/>
+      </w:pPr>
+      <w:rPr>
+        <w:rFonts w:ascii="Wingdings" w:hAnsi="Wingdings" w:hint="default"/>
+        <w:sz w:val="20"/>
+      </w:rPr>
+    </w:lvl>
+    <w:lvl w:ilvl="8" w:tentative="1">
+      <w:start w:val="1"/>
+      <w:numFmt w:val="bullet"/>
+      <w:lvlText w:val=""/>
+      <w:lvlJc w:val="left"/>
+      <w:pPr>
+        <w:tabs>
+          <w:tab w:val="num" w:pos="6480"/>
+        </w:tabs>
+        <w:ind w:left="6480" w:hanging="360"/>
+      </w:pPr>
+      <w:rPr>
+        <w:rFonts w:ascii="Wingdings" w:hAnsi="Wingdings" w:hint="default"/>
+        <w:sz w:val="20"/>
+      </w:rPr>
+    </w:lvl>
+  </w:abstractNum>
+  <w:abstractNum w:abstractNumId="1" w15:restartNumberingAfterBreak="0">
+    <w:nsid w:val="77A70AA4"/>
+    <w:multiLevelType w:val="multilevel"/>
+    <w:tmpl w:val="EF5AF380"/>
+    <w:lvl w:ilvl="0">
+      <w:start w:val="1"/>
+      <w:numFmt w:val="bullet"/>
+      <w:lvlText w:val=""/>
+      <w:lvlJc w:val="left"/>
+      <w:pPr>
+        <w:tabs>
+          <w:tab w:val="num" w:pos="720"/>
+        </w:tabs>
+        <w:ind w:left="720" w:hanging="360"/>
+      </w:pPr>
+      <w:rPr>
+        <w:rFonts w:ascii="Symbol" w:hAnsi="Symbol" w:hint="default"/>
+        <w:sz w:val="20"/>
+      </w:rPr>
+    </w:lvl>
+    <w:lvl w:ilvl="1" w:tentative="1">
+      <w:start w:val="1"/>
+      <w:numFmt w:val="bullet"/>
+      <w:lvlText w:val="o"/>
+      <w:lvlJc w:val="left"/>
+      <w:pPr>
+        <w:tabs>
+          <w:tab w:val="num" w:pos="1440"/>
+        </w:tabs>
+        <w:ind w:left="1440" w:hanging="360"/>
+      </w:pPr>
+      <w:rPr>
+        <w:rFonts w:ascii="Courier New" w:hAnsi="Courier New" w:hint="default"/>
+        <w:sz w:val="20"/>
+      </w:rPr>
+    </w:lvl>
+    <w:lvl w:ilvl="2" w:tentative="1">
+      <w:start w:val="1"/>
+      <w:numFmt w:val="bullet"/>
+      <w:lvlText w:val=""/>
+      <w:lvlJc w:val="left"/>
+      <w:pPr>
+        <w:tabs>
+          <w:tab w:val="num" w:pos="2160"/>
+        </w:tabs>
+        <w:ind w:left="2160" w:hanging="360"/>
+      </w:pPr>
+      <w:rPr>
+        <w:rFonts w:ascii="Wingdings" w:hAnsi="Wingdings" w:hint="default"/>
+        <w:sz w:val="20"/>
+      </w:rPr>
+    </w:lvl>
+    <w:lvl w:ilvl="3" w:tentative="1">
+      <w:start w:val="1"/>
+      <w:numFmt w:val="bullet"/>
+      <w:lvlText w:val=""/>
+      <w:lvlJc w:val="left"/>
+      <w:pPr>
+        <w:tabs>
+          <w:tab w:val="num" w:pos="2880"/>
+        </w:tabs>
+        <w:ind w:left="2880" w:hanging="360"/>
+      </w:pPr>
+      <w:rPr>
+        <w:rFonts w:ascii="Wingdings" w:hAnsi="Wingdings" w:hint="default"/>
+        <w:sz w:val="20"/>
+      </w:rPr>
+    </w:lvl>
+    <w:lvl w:ilvl="4" w:tentative="1">
+      <w:start w:val="1"/>
+      <w:numFmt w:val="bullet"/>
+      <w:lvlText w:val=""/>
+      <w:lvlJc w:val="left"/>
+      <w:pPr>
+        <w:tabs>
+          <w:tab w:val="num" w:pos="3600"/>
+        </w:tabs>
+        <w:ind w:left="3600" w:hanging="360"/>
+      </w:pPr>
+      <w:rPr>
+        <w:rFonts w:ascii="Wingdings" w:hAnsi="Wingdings" w:hint="default"/>
+        <w:sz w:val="20"/>
+      </w:rPr>
+    </w:lvl>
+    <w:lvl w:ilvl="5" w:tentative="1">
+      <w:start w:val="1"/>
+      <w:numFmt w:val="bullet"/>
+      <w:lvlText w:val=""/>
+      <w:lvlJc w:val="left"/>
+      <w:pPr>
+        <w:tabs>
+          <w:tab w:val="num" w:pos="4320"/>
+        </w:tabs>
+        <w:ind w:left="4320" w:hanging="360"/>
+      </w:pPr>
+      <w:rPr>
+        <w:rFonts w:ascii="Wingdings" w:hAnsi="Wingdings" w:hint="default"/>
+        <w:sz w:val="20"/>
+      </w:rPr>
+    </w:lvl>
+    <w:lvl w:ilvl="6" w:tentative="1">
+      <w:start w:val="1"/>
+      <w:numFmt w:val="bullet"/>
+      <w:lvlText w:val=""/>
+      <w:lvlJc w:val="left"/>
+      <w:pPr>
+        <w:tabs>
+          <w:tab w:val="num" w:pos="5040"/>
+        </w:tabs>
+        <w:ind w:left="5040" w:hanging="360"/>
+      </w:pPr>
+      <w:rPr>
+        <w:rFonts w:ascii="Wingdings" w:hAnsi="Wingdings" w:hint="default"/>
+        <w:sz w:val="20"/>
+      </w:rPr>
+    </w:lvl>
+    <w:lvl w:ilvl="7" w:tentative="1">
+      <w:start w:val="1"/>
+      <w:numFmt w:val="bullet"/>
+      <w:lvlText w:val=""/>
+      <w:lvlJc w:val="left"/>
+      <w:pPr>
+        <w:tabs>
+          <w:tab w:val="num" w:pos="5760"/>
+        </w:tabs>
+        <w:ind w:left="5760" w:hanging="360"/>
+      </w:pPr>
+      <w:rPr>
+        <w:rFonts w:ascii="Wingdings" w:hAnsi="Wingdings" w:hint="default"/>
+        <w:sz w:val="20"/>
+      </w:rPr>
+    </w:lvl>
+    <w:lvl w:ilvl="8" w:tentative="1">
+      <w:start w:val="1"/>
+      <w:numFmt w:val="bullet"/>
+      <w:lvlText w:val=""/>
+      <w:lvlJc w:val="left"/>
+      <w:pPr>
+        <w:tabs>
+          <w:tab w:val="num" w:pos="6480"/>
+        </w:tabs>
+        <w:ind w:left="6480" w:hanging="360"/>
+      </w:pPr>
+      <w:rPr>
+        <w:rFonts w:ascii="Wingdings" w:hAnsi="Wingdings" w:hint="default"/>
+        <w:sz w:val="20"/>
+      </w:rPr>
+    </w:lvl>
+  </w:abstractNum>
+  <w:num w:numId="1" w16cid:durableId="1388726387">
+    <w:abstractNumId w:val="0"/>
+  </w:num>
+  <w:num w:numId="2" w16cid:durableId="318966414">
+    <w:abstractNumId w:val="1"/>
+  </w:num>
+</w:numbering>
 </file>
 
 <file path=word/styles.xml><?xml version="1.0" encoding="utf-8"?>
@@ -942,6 +1902,50 @@
       <w:spacing w:val="5"/>
     </w:rPr>
   </w:style>
+  <w:style w:type="paragraph" w:styleId="Header">
+    <w:name w:val="header"/>
+    <w:basedOn w:val="Normal"/>
+    <w:link w:val="HeaderChar"/>
+    <w:uiPriority w:val="99"/>
+    <w:unhideWhenUsed/>
+    <w:rsid w:val="0045318A"/>
+    <w:pPr>
+      <w:tabs>
+        <w:tab w:val="center" w:pos="4680"/>
+        <w:tab w:val="right" w:pos="9360"/>
+      </w:tabs>
+      <w:spacing w:after="0" w:line="240" w:lineRule="auto"/>
+    </w:pPr>
+  </w:style>
+  <w:style w:type="character" w:customStyle="1" w:styleId="HeaderChar">
+    <w:name w:val="Header Char"/>
+    <w:basedOn w:val="DefaultParagraphFont"/>
+    <w:link w:val="Header"/>
+    <w:uiPriority w:val="99"/>
+    <w:rsid w:val="0045318A"/>
+  </w:style>
+  <w:style w:type="paragraph" w:styleId="Footer">
+    <w:name w:val="footer"/>
+    <w:basedOn w:val="Normal"/>
+    <w:link w:val="FooterChar"/>
+    <w:uiPriority w:val="99"/>
+    <w:unhideWhenUsed/>
+    <w:rsid w:val="0045318A"/>
+    <w:pPr>
+      <w:tabs>
+        <w:tab w:val="center" w:pos="4680"/>
+        <w:tab w:val="right" w:pos="9360"/>
+      </w:tabs>
+      <w:spacing w:after="0" w:line="240" w:lineRule="auto"/>
+    </w:pPr>
+  </w:style>
+  <w:style w:type="character" w:customStyle="1" w:styleId="FooterChar">
+    <w:name w:val="Footer Char"/>
+    <w:basedOn w:val="DefaultParagraphFont"/>
+    <w:link w:val="Footer"/>
+    <w:uiPriority w:val="99"/>
+    <w:rsid w:val="0045318A"/>
+  </w:style>
 </w:styles>
 </file>
 

</xml_diff>